<commit_message>
updated the Cybersecurity Monitoring Plan and Software Bill of Materials Lifecycles document (made law enforcement material generic / corrected typos)
</commit_message>
<xml_diff>
--- a/source/reference_documents/secondary_documents/foundation phase/Cybersecurity Monitoring Plan/Cybersecurity Monitoring Plan.docx
+++ b/source/reference_documents/secondary_documents/foundation phase/Cybersecurity Monitoring Plan/Cybersecurity Monitoring Plan.docx
@@ -1,6 +1,6 @@
 
 <file path=word/document.xml><?xml version="1.0" encoding="utf-8"?>
-<w:document xmlns:wpc="http://schemas.microsoft.com/office/word/2010/wordprocessingCanvas" xmlns:cx="http://schemas.microsoft.com/office/drawing/2014/chartex" xmlns:cx1="http://schemas.microsoft.com/office/drawing/2015/9/8/chartex" xmlns:cx2="http://schemas.microsoft.com/office/drawing/2015/10/21/chartex" xmlns:cx3="http://schemas.microsoft.com/office/drawing/2016/5/9/chartex" xmlns:cx4="http://schemas.microsoft.com/office/drawing/2016/5/10/chartex" xmlns:cx5="http://schemas.microsoft.com/office/drawing/2016/5/11/chartex" xmlns:cx6="http://schemas.microsoft.com/office/drawing/2016/5/12/chartex" xmlns:cx7="http://schemas.microsoft.com/office/drawing/2016/5/13/chartex" xmlns:cx8="http://schemas.microsoft.com/office/drawing/2016/5/14/chartex" xmlns:mc="http://schemas.openxmlformats.org/markup-compatibility/2006" xmlns:aink="http://schemas.microsoft.com/office/drawing/2016/ink" xmlns:am3d="http://schemas.microsoft.com/office/drawing/2017/model3d" xmlns:o="urn:schemas-microsoft-com:office:office" xmlns:oel="http://schemas.microsoft.com/office/2019/extlst" xmlns:r="http://schemas.openxmlformats.org/officeDocument/2006/relationships" xmlns:m="http://schemas.openxmlformats.org/officeDocument/2006/math" xmlns:v="urn:schemas-microsoft-com:vml" xmlns:wp14="http://schemas.microsoft.com/office/word/2010/wordprocessingDrawing" xmlns:wp="http://schemas.openxmlformats.org/drawingml/2006/wordprocessingDrawing" xmlns:w10="urn:schemas-microsoft-com:office:word" xmlns:w="http://schemas.openxmlformats.org/wordprocessingml/2006/main" xmlns:w14="http://schemas.microsoft.com/office/word/2010/wordml" xmlns:w15="http://schemas.microsoft.com/office/word/2012/wordml" xmlns:w16cex="http://schemas.microsoft.com/office/word/2018/wordml/cex" xmlns:w16cid="http://schemas.microsoft.com/office/word/2016/wordml/cid" xmlns:w16="http://schemas.microsoft.com/office/word/2018/wordml" xmlns:w16sdtdh="http://schemas.microsoft.com/office/word/2020/wordml/sdtdatahash" xmlns:w16se="http://schemas.microsoft.com/office/word/2015/wordml/symex" xmlns:wpg="http://schemas.microsoft.com/office/word/2010/wordprocessingGroup" xmlns:wpi="http://schemas.microsoft.com/office/word/2010/wordprocessingInk" xmlns:wne="http://schemas.microsoft.com/office/word/2006/wordml" xmlns:wps="http://schemas.microsoft.com/office/word/2010/wordprocessingShape" mc:Ignorable="w14 w15 w16se w16cid w16 w16cex w16sdtdh wp14">
+<w:document xmlns:wpc="http://schemas.microsoft.com/office/word/2010/wordprocessingCanvas" xmlns:cx="http://schemas.microsoft.com/office/drawing/2014/chartex" xmlns:cx1="http://schemas.microsoft.com/office/drawing/2015/9/8/chartex" xmlns:cx2="http://schemas.microsoft.com/office/drawing/2015/10/21/chartex" xmlns:cx3="http://schemas.microsoft.com/office/drawing/2016/5/9/chartex" xmlns:cx4="http://schemas.microsoft.com/office/drawing/2016/5/10/chartex" xmlns:cx5="http://schemas.microsoft.com/office/drawing/2016/5/11/chartex" xmlns:cx6="http://schemas.microsoft.com/office/drawing/2016/5/12/chartex" xmlns:cx7="http://schemas.microsoft.com/office/drawing/2016/5/13/chartex" xmlns:cx8="http://schemas.microsoft.com/office/drawing/2016/5/14/chartex" xmlns:mc="http://schemas.openxmlformats.org/markup-compatibility/2006" xmlns:aink="http://schemas.microsoft.com/office/drawing/2016/ink" xmlns:am3d="http://schemas.microsoft.com/office/drawing/2017/model3d" xmlns:o="urn:schemas-microsoft-com:office:office" xmlns:oel="http://schemas.microsoft.com/office/2019/extlst" xmlns:r="http://schemas.openxmlformats.org/officeDocument/2006/relationships" xmlns:m="http://schemas.openxmlformats.org/officeDocument/2006/math" xmlns:v="urn:schemas-microsoft-com:vml" xmlns:wp14="http://schemas.microsoft.com/office/word/2010/wordprocessingDrawing" xmlns:wp="http://schemas.openxmlformats.org/drawingml/2006/wordprocessingDrawing" xmlns:w10="urn:schemas-microsoft-com:office:word" xmlns:w="http://schemas.openxmlformats.org/wordprocessingml/2006/main" xmlns:w14="http://schemas.microsoft.com/office/word/2010/wordml" xmlns:w15="http://schemas.microsoft.com/office/word/2012/wordml" xmlns:w16cex="http://schemas.microsoft.com/office/word/2018/wordml/cex" xmlns:w16cid="http://schemas.microsoft.com/office/word/2016/wordml/cid" xmlns:w16="http://schemas.microsoft.com/office/word/2018/wordml" xmlns:w16du="http://schemas.microsoft.com/office/word/2023/wordml/word16du" xmlns:w16sdtdh="http://schemas.microsoft.com/office/word/2020/wordml/sdtdatahash" xmlns:w16sdtfl="http://schemas.microsoft.com/office/word/2024/wordml/sdtformatlock" xmlns:w16se="http://schemas.microsoft.com/office/word/2015/wordml/symex" xmlns:wpg="http://schemas.microsoft.com/office/word/2010/wordprocessingGroup" xmlns:wpi="http://schemas.microsoft.com/office/word/2010/wordprocessingInk" xmlns:wne="http://schemas.microsoft.com/office/word/2006/wordml" xmlns:wps="http://schemas.microsoft.com/office/word/2010/wordprocessingShape" mc:Ignorable="w14 w15 w16se w16cid w16 w16cex w16sdtdh w16sdtfl w16du wp14">
   <w:body>
     <w:p>
       <w:pPr>
@@ -28,7 +28,7 @@
         <w:t xml:space="preserve">Version </w:t>
       </w:r>
       <w:r>
-        <w:t>9</w:t>
+        <w:t>10</w:t>
       </w:r>
     </w:p>
     <w:p>
@@ -45,7 +45,7 @@
         <w:rPr>
           <w:noProof/>
         </w:rPr>
-        <w:t>9/8/23 9:33 AM</w:t>
+        <w:t>11/19/25 1:40 PM</w:t>
       </w:r>
       <w:r>
         <w:fldChar w:fldCharType="end"/>
@@ -146,48 +146,7 @@
         </w:rPr>
       </w:pPr>
       <w:r>
-        <w:t xml:space="preserve">This document is motivated by the need to have formal processes in place for the monitoring of activities and events possibly affecting safety-critical, cyber-physical systems in the field for certification of compliance to standards such as </w:t>
-      </w:r>
-      <w:r>
-        <w:rPr>
-          <w:b/>
-          <w:bCs/>
-        </w:rPr>
-        <w:t>ISO</w:t>
-      </w:r>
-      <w:r>
-        <w:rPr>
-          <w:b/>
-          <w:bCs/>
-        </w:rPr>
-        <w:t>/SAE</w:t>
-      </w:r>
-      <w:r>
-        <w:rPr>
-          <w:b/>
-          <w:bCs/>
-        </w:rPr>
-        <w:t xml:space="preserve"> 21434</w:t>
-      </w:r>
-      <w:r>
-        <w:t xml:space="preserve"> and </w:t>
-      </w:r>
-      <w:r>
-        <w:rPr>
-          <w:b/>
-          <w:bCs/>
-        </w:rPr>
-        <w:t xml:space="preserve">ISO </w:t>
-      </w:r>
-      <w:r>
-        <w:rPr>
-          <w:b/>
-          <w:bCs/>
-        </w:rPr>
-        <w:t>26262</w:t>
-      </w:r>
-      <w:r>
-        <w:t>.</w:t>
+        <w:t>This document is motivated by the need to have formal processes in place for the monitoring of activities and events possibly affecting safety-critical, cyber-physical systems.</w:t>
       </w:r>
     </w:p>
     <w:p>
@@ -215,7 +174,19 @@
         <w:rPr>
           <w:lang w:val="en-US"/>
         </w:rPr>
-        <w:t xml:space="preserve">was created by </w:t>
+        <w:t xml:space="preserve">was </w:t>
+      </w:r>
+      <w:r>
+        <w:rPr>
+          <w:lang w:val="en-US"/>
+        </w:rPr>
+        <w:t xml:space="preserve">originally </w:t>
+      </w:r>
+      <w:r>
+        <w:rPr>
+          <w:lang w:val="en-US"/>
+        </w:rPr>
+        <w:t xml:space="preserve">created by </w:t>
       </w:r>
       <w:r>
         <w:rPr>
@@ -407,6 +378,9 @@
       <w:r>
         <w:t>government sources</w:t>
       </w:r>
+      <w:r>
+        <w:t xml:space="preserve"> (including law enforcement)</w:t>
+      </w:r>
     </w:p>
     <w:p>
       <w:pPr>
@@ -628,9 +602,9 @@
           <w:noProof/>
         </w:rPr>
         <w:drawing>
-          <wp:inline distT="0" distB="0" distL="0" distR="0" wp14:anchorId="128E7306" wp14:editId="1AA5DB7C">
-            <wp:extent cx="4868333" cy="7748374"/>
-            <wp:effectExtent l="0" t="0" r="0" b="0"/>
+          <wp:inline distT="0" distB="0" distL="0" distR="0" wp14:anchorId="128E7306" wp14:editId="53A74870">
+            <wp:extent cx="4793381" cy="7631569"/>
+            <wp:effectExtent l="0" t="0" r="0" b="1270"/>
             <wp:docPr id="1" name="Picture 1"/>
             <wp:cNvGraphicFramePr>
               <a:graphicFrameLocks xmlns:a="http://schemas.openxmlformats.org/drawingml/2006/main" noChangeAspect="1"/>
@@ -643,7 +617,7 @@
                     <pic:cNvPicPr/>
                   </pic:nvPicPr>
                   <pic:blipFill>
-                    <a:blip r:embed="rId8">
+                    <a:blip r:embed="rId8" cstate="print">
                       <a:extLst>
                         <a:ext uri="{28A0092B-C50C-407E-A947-70E740481C1C}">
                           <a14:useLocalDpi xmlns:a14="http://schemas.microsoft.com/office/drawing/2010/main" val="0"/>
@@ -657,7 +631,7 @@
                   <pic:spPr>
                     <a:xfrm>
                       <a:off x="0" y="0"/>
-                      <a:ext cx="4896488" cy="7793186"/>
+                      <a:ext cx="4800126" cy="7642307"/>
                     </a:xfrm>
                     <a:prstGeom prst="rect">
                       <a:avLst/>
@@ -690,12 +664,15 @@
       <w:bookmarkStart w:id="5" w:name="_l8tczglerpbs" w:colFirst="0" w:colLast="0"/>
       <w:bookmarkEnd w:id="5"/>
       <w:r>
-        <w:t>LEO Incident Submission</w:t>
+        <w:t>Law Enforcement</w:t>
+      </w:r>
+      <w:r>
+        <w:t xml:space="preserve"> Incident Submission</w:t>
       </w:r>
     </w:p>
     <w:tbl>
       <w:tblPr>
-        <w:tblW w:w="4940" w:type="dxa"/>
+        <w:tblW w:w="6200" w:type="dxa"/>
         <w:tblBorders>
           <w:top w:val="single" w:sz="8" w:space="0" w:color="000000"/>
           <w:left w:val="single" w:sz="8" w:space="0" w:color="000000"/>
@@ -709,13 +686,12 @@
       </w:tblPr>
       <w:tblGrid>
         <w:gridCol w:w="1598"/>
-        <w:gridCol w:w="3342"/>
+        <w:gridCol w:w="4602"/>
       </w:tblGrid>
       <w:tr>
         <w:tc>
           <w:tcPr>
             <w:tcW w:w="1598" w:type="dxa"/>
-            <w:shd w:val="clear" w:color="auto" w:fill="auto"/>
             <w:tcMar>
               <w:top w:w="100" w:type="dxa"/>
               <w:left w:w="100" w:type="dxa"/>
@@ -747,8 +723,7 @@
         </w:tc>
         <w:tc>
           <w:tcPr>
-            <w:tcW w:w="3342" w:type="dxa"/>
-            <w:shd w:val="clear" w:color="auto" w:fill="auto"/>
+            <w:tcW w:w="4602" w:type="dxa"/>
             <w:tcMar>
               <w:top w:w="100" w:type="dxa"/>
               <w:left w:w="100" w:type="dxa"/>
@@ -762,7 +737,16 @@
               <w:spacing w:line="240" w:lineRule="auto"/>
             </w:pPr>
             <w:r>
-              <w:t>LEO Incident</w:t>
+              <w:t>Law enforcement</w:t>
+            </w:r>
+            <w:r>
+              <w:t xml:space="preserve"> </w:t>
+            </w:r>
+            <w:r>
+              <w:t>i</w:t>
+            </w:r>
+            <w:r>
+              <w:t>ncident</w:t>
             </w:r>
           </w:p>
         </w:tc>
@@ -774,7 +758,6 @@
         <w:tc>
           <w:tcPr>
             <w:tcW w:w="1598" w:type="dxa"/>
-            <w:shd w:val="clear" w:color="auto" w:fill="auto"/>
             <w:tcMar>
               <w:top w:w="100" w:type="dxa"/>
               <w:left w:w="100" w:type="dxa"/>
@@ -804,8 +787,7 @@
         </w:tc>
         <w:tc>
           <w:tcPr>
-            <w:tcW w:w="3342" w:type="dxa"/>
-            <w:shd w:val="clear" w:color="auto" w:fill="auto"/>
+            <w:tcW w:w="4602" w:type="dxa"/>
             <w:tcMar>
               <w:top w:w="100" w:type="dxa"/>
               <w:left w:w="100" w:type="dxa"/>
@@ -831,7 +813,16 @@
               <w:spacing w:line="240" w:lineRule="auto"/>
             </w:pPr>
             <w:r>
-              <w:t>LEO incident submission report</w:t>
+              <w:t xml:space="preserve">Law </w:t>
+            </w:r>
+            <w:r>
+              <w:t>e</w:t>
+            </w:r>
+            <w:r>
+              <w:t xml:space="preserve">nforcement </w:t>
+            </w:r>
+            <w:r>
+              <w:t>incident submission report</w:t>
             </w:r>
           </w:p>
         </w:tc>
@@ -840,7 +831,6 @@
         <w:tc>
           <w:tcPr>
             <w:tcW w:w="1598" w:type="dxa"/>
-            <w:shd w:val="clear" w:color="auto" w:fill="auto"/>
             <w:tcMar>
               <w:top w:w="100" w:type="dxa"/>
               <w:left w:w="100" w:type="dxa"/>
@@ -870,8 +860,7 @@
         </w:tc>
         <w:tc>
           <w:tcPr>
-            <w:tcW w:w="3342" w:type="dxa"/>
-            <w:shd w:val="clear" w:color="auto" w:fill="auto"/>
+            <w:tcW w:w="4602" w:type="dxa"/>
             <w:tcMar>
               <w:top w:w="100" w:type="dxa"/>
               <w:left w:w="100" w:type="dxa"/>
@@ -885,7 +874,13 @@
               <w:spacing w:line="240" w:lineRule="auto"/>
             </w:pPr>
             <w:r>
-              <w:t>Law Enforcement</w:t>
+              <w:t xml:space="preserve">Law </w:t>
+            </w:r>
+            <w:r>
+              <w:t>e</w:t>
+            </w:r>
+            <w:r>
+              <w:t>nforcement</w:t>
             </w:r>
           </w:p>
         </w:tc>
@@ -901,9 +896,9 @@
           <w:noProof/>
         </w:rPr>
         <w:drawing>
-          <wp:inline distT="0" distB="0" distL="0" distR="0" wp14:anchorId="57AFDDF2" wp14:editId="5F9ECE17">
-            <wp:extent cx="4315460" cy="4411147"/>
-            <wp:effectExtent l="0" t="0" r="2540" b="0"/>
+          <wp:inline distT="0" distB="0" distL="0" distR="0" wp14:anchorId="57AFDDF2" wp14:editId="04C9FACD">
+            <wp:extent cx="4318681" cy="4405054"/>
+            <wp:effectExtent l="0" t="0" r="0" b="1905"/>
             <wp:docPr id="2" name="Picture 2"/>
             <wp:cNvGraphicFramePr>
               <a:graphicFrameLocks xmlns:a="http://schemas.openxmlformats.org/drawingml/2006/main" noChangeAspect="1"/>
@@ -916,7 +911,7 @@
                     <pic:cNvPicPr/>
                   </pic:nvPicPr>
                   <pic:blipFill>
-                    <a:blip r:embed="rId9">
+                    <a:blip r:embed="rId9" cstate="print">
                       <a:extLst>
                         <a:ext uri="{28A0092B-C50C-407E-A947-70E740481C1C}">
                           <a14:useLocalDpi xmlns:a14="http://schemas.microsoft.com/office/drawing/2010/main" val="0"/>
@@ -930,7 +925,7 @@
                   <pic:spPr>
                     <a:xfrm>
                       <a:off x="0" y="0"/>
-                      <a:ext cx="4318681" cy="4414439"/>
+                      <a:ext cx="4318681" cy="4405054"/>
                     </a:xfrm>
                     <a:prstGeom prst="rect">
                       <a:avLst/>
@@ -963,7 +958,14 @@
           <w:b/>
           <w:bCs/>
         </w:rPr>
-        <w:t>LEO Incident</w:t>
+        <w:t>Law Enforcement</w:t>
+      </w:r>
+      <w:r>
+        <w:rPr>
+          <w:b/>
+          <w:bCs/>
+        </w:rPr>
+        <w:t xml:space="preserve"> Incident</w:t>
       </w:r>
       <w:r>
         <w:t xml:space="preserve">. </w:t>
@@ -976,7 +978,21 @@
           <w:b/>
           <w:bCs/>
         </w:rPr>
-        <w:t>LEO Incident</w:t>
+        <w:t>Law Enforcement</w:t>
+      </w:r>
+      <w:r>
+        <w:rPr>
+          <w:b/>
+          <w:bCs/>
+        </w:rPr>
+        <w:t xml:space="preserve"> </w:t>
+      </w:r>
+      <w:r>
+        <w:rPr>
+          <w:b/>
+          <w:bCs/>
+        </w:rPr>
+        <w:t>Incident</w:t>
       </w:r>
       <w:r>
         <w:t xml:space="preserve"> is normalized into an</w:t>
@@ -1015,7 +1031,21 @@
           <w:b/>
           <w:bCs/>
         </w:rPr>
-        <w:t>LEO Incident Submission Report</w:t>
+        <w:t>Law Enforcement</w:t>
+      </w:r>
+      <w:r>
+        <w:rPr>
+          <w:b/>
+          <w:bCs/>
+        </w:rPr>
+        <w:t xml:space="preserve"> </w:t>
+      </w:r>
+      <w:r>
+        <w:rPr>
+          <w:b/>
+          <w:bCs/>
+        </w:rPr>
+        <w:t>Incident Submission Report</w:t>
       </w:r>
       <w:r>
         <w:t xml:space="preserve"> </w:t>
@@ -1113,7 +1143,6 @@
         <w:tc>
           <w:tcPr>
             <w:tcW w:w="1598" w:type="dxa"/>
-            <w:shd w:val="clear" w:color="auto" w:fill="auto"/>
             <w:tcMar>
               <w:top w:w="100" w:type="dxa"/>
               <w:left w:w="100" w:type="dxa"/>
@@ -1144,7 +1173,6 @@
         <w:tc>
           <w:tcPr>
             <w:tcW w:w="6852" w:type="dxa"/>
-            <w:shd w:val="clear" w:color="auto" w:fill="auto"/>
             <w:tcMar>
               <w:top w:w="100" w:type="dxa"/>
               <w:left w:w="100" w:type="dxa"/>
@@ -1182,7 +1210,6 @@
         <w:tc>
           <w:tcPr>
             <w:tcW w:w="1598" w:type="dxa"/>
-            <w:shd w:val="clear" w:color="auto" w:fill="auto"/>
             <w:tcMar>
               <w:top w:w="100" w:type="dxa"/>
               <w:left w:w="100" w:type="dxa"/>
@@ -1213,7 +1240,6 @@
         <w:tc>
           <w:tcPr>
             <w:tcW w:w="6852" w:type="dxa"/>
-            <w:shd w:val="clear" w:color="auto" w:fill="auto"/>
             <w:tcMar>
               <w:top w:w="100" w:type="dxa"/>
               <w:left w:w="100" w:type="dxa"/>
@@ -1248,7 +1274,6 @@
         <w:tc>
           <w:tcPr>
             <w:tcW w:w="1598" w:type="dxa"/>
-            <w:shd w:val="clear" w:color="auto" w:fill="auto"/>
             <w:tcMar>
               <w:top w:w="100" w:type="dxa"/>
               <w:left w:w="100" w:type="dxa"/>
@@ -1279,7 +1304,6 @@
         <w:tc>
           <w:tcPr>
             <w:tcW w:w="6852" w:type="dxa"/>
-            <w:shd w:val="clear" w:color="auto" w:fill="auto"/>
             <w:tcMar>
               <w:top w:w="100" w:type="dxa"/>
               <w:left w:w="100" w:type="dxa"/>
@@ -1681,7 +1705,6 @@
         <w:tc>
           <w:tcPr>
             <w:tcW w:w="1598" w:type="dxa"/>
-            <w:shd w:val="clear" w:color="auto" w:fill="auto"/>
             <w:tcMar>
               <w:top w:w="100" w:type="dxa"/>
               <w:left w:w="100" w:type="dxa"/>
@@ -1712,7 +1735,6 @@
         <w:tc>
           <w:tcPr>
             <w:tcW w:w="4602" w:type="dxa"/>
-            <w:shd w:val="clear" w:color="auto" w:fill="auto"/>
             <w:tcMar>
               <w:top w:w="100" w:type="dxa"/>
               <w:left w:w="100" w:type="dxa"/>
@@ -1738,7 +1760,6 @@
         <w:tc>
           <w:tcPr>
             <w:tcW w:w="1598" w:type="dxa"/>
-            <w:shd w:val="clear" w:color="auto" w:fill="auto"/>
             <w:tcMar>
               <w:top w:w="100" w:type="dxa"/>
               <w:left w:w="100" w:type="dxa"/>
@@ -1769,7 +1790,6 @@
         <w:tc>
           <w:tcPr>
             <w:tcW w:w="4602" w:type="dxa"/>
-            <w:shd w:val="clear" w:color="auto" w:fill="auto"/>
             <w:tcMar>
               <w:top w:w="100" w:type="dxa"/>
               <w:left w:w="100" w:type="dxa"/>
@@ -1804,7 +1824,6 @@
         <w:tc>
           <w:tcPr>
             <w:tcW w:w="1598" w:type="dxa"/>
-            <w:shd w:val="clear" w:color="auto" w:fill="auto"/>
             <w:tcMar>
               <w:top w:w="100" w:type="dxa"/>
               <w:left w:w="100" w:type="dxa"/>
@@ -1835,7 +1854,6 @@
         <w:tc>
           <w:tcPr>
             <w:tcW w:w="4602" w:type="dxa"/>
-            <w:shd w:val="clear" w:color="auto" w:fill="auto"/>
             <w:tcMar>
               <w:top w:w="100" w:type="dxa"/>
               <w:left w:w="100" w:type="dxa"/>
@@ -2128,7 +2146,6 @@
         <w:tc>
           <w:tcPr>
             <w:tcW w:w="1598" w:type="dxa"/>
-            <w:shd w:val="clear" w:color="auto" w:fill="auto"/>
             <w:tcMar>
               <w:top w:w="100" w:type="dxa"/>
               <w:left w:w="100" w:type="dxa"/>
@@ -2159,7 +2176,6 @@
         <w:tc>
           <w:tcPr>
             <w:tcW w:w="4602" w:type="dxa"/>
-            <w:shd w:val="clear" w:color="auto" w:fill="auto"/>
             <w:tcMar>
               <w:top w:w="100" w:type="dxa"/>
               <w:left w:w="100" w:type="dxa"/>
@@ -2185,7 +2201,6 @@
         <w:tc>
           <w:tcPr>
             <w:tcW w:w="1598" w:type="dxa"/>
-            <w:shd w:val="clear" w:color="auto" w:fill="auto"/>
             <w:tcMar>
               <w:top w:w="100" w:type="dxa"/>
               <w:left w:w="100" w:type="dxa"/>
@@ -2216,7 +2231,6 @@
         <w:tc>
           <w:tcPr>
             <w:tcW w:w="4602" w:type="dxa"/>
-            <w:shd w:val="clear" w:color="auto" w:fill="auto"/>
             <w:tcMar>
               <w:top w:w="100" w:type="dxa"/>
               <w:left w:w="100" w:type="dxa"/>
@@ -2248,7 +2262,6 @@
         <w:tc>
           <w:tcPr>
             <w:tcW w:w="1598" w:type="dxa"/>
-            <w:shd w:val="clear" w:color="auto" w:fill="auto"/>
             <w:tcMar>
               <w:top w:w="100" w:type="dxa"/>
               <w:left w:w="100" w:type="dxa"/>
@@ -2279,7 +2292,6 @@
         <w:tc>
           <w:tcPr>
             <w:tcW w:w="4602" w:type="dxa"/>
-            <w:shd w:val="clear" w:color="auto" w:fill="auto"/>
             <w:tcMar>
               <w:top w:w="100" w:type="dxa"/>
               <w:left w:w="100" w:type="dxa"/>
@@ -2358,15 +2370,7 @@
         <w:jc w:val="both"/>
       </w:pPr>
       <w:r>
-        <w:t xml:space="preserve">A supplier communicates </w:t>
-      </w:r>
-      <w:proofErr w:type="gramStart"/>
-      <w:r>
-        <w:t>an</w:t>
-      </w:r>
-      <w:proofErr w:type="gramEnd"/>
-      <w:r>
-        <w:t xml:space="preserve"> </w:t>
+        <w:t xml:space="preserve">A supplier communicates a </w:t>
       </w:r>
       <w:r>
         <w:rPr>
@@ -2538,7 +2542,6 @@
         <w:tc>
           <w:tcPr>
             <w:tcW w:w="1598" w:type="dxa"/>
-            <w:shd w:val="clear" w:color="auto" w:fill="auto"/>
             <w:tcMar>
               <w:top w:w="100" w:type="dxa"/>
               <w:left w:w="100" w:type="dxa"/>
@@ -2569,7 +2572,6 @@
         <w:tc>
           <w:tcPr>
             <w:tcW w:w="3342" w:type="dxa"/>
-            <w:shd w:val="clear" w:color="auto" w:fill="auto"/>
             <w:tcMar>
               <w:top w:w="100" w:type="dxa"/>
               <w:left w:w="100" w:type="dxa"/>
@@ -2595,7 +2597,6 @@
         <w:tc>
           <w:tcPr>
             <w:tcW w:w="1598" w:type="dxa"/>
-            <w:shd w:val="clear" w:color="auto" w:fill="auto"/>
             <w:tcMar>
               <w:top w:w="100" w:type="dxa"/>
               <w:left w:w="100" w:type="dxa"/>
@@ -2626,7 +2627,6 @@
         <w:tc>
           <w:tcPr>
             <w:tcW w:w="3342" w:type="dxa"/>
-            <w:shd w:val="clear" w:color="auto" w:fill="auto"/>
             <w:tcMar>
               <w:top w:w="100" w:type="dxa"/>
               <w:left w:w="100" w:type="dxa"/>
@@ -2667,7 +2667,6 @@
         <w:tc>
           <w:tcPr>
             <w:tcW w:w="1598" w:type="dxa"/>
-            <w:shd w:val="clear" w:color="auto" w:fill="auto"/>
             <w:tcMar>
               <w:top w:w="100" w:type="dxa"/>
               <w:left w:w="100" w:type="dxa"/>
@@ -2698,7 +2697,6 @@
         <w:tc>
           <w:tcPr>
             <w:tcW w:w="3342" w:type="dxa"/>
-            <w:shd w:val="clear" w:color="auto" w:fill="auto"/>
             <w:tcMar>
               <w:top w:w="100" w:type="dxa"/>
               <w:left w:w="100" w:type="dxa"/>
@@ -2941,7 +2939,35 @@
           <w:b/>
           <w:bCs/>
         </w:rPr>
-        <w:t>Incident Repose Plan</w:t>
+        <w:t>Incident Re</w:t>
+      </w:r>
+      <w:r>
+        <w:rPr>
+          <w:b/>
+          <w:bCs/>
+        </w:rPr>
+        <w:t>s</w:t>
+      </w:r>
+      <w:r>
+        <w:rPr>
+          <w:b/>
+          <w:bCs/>
+        </w:rPr>
+        <w:t>po</w:t>
+      </w:r>
+      <w:r>
+        <w:rPr>
+          <w:b/>
+          <w:bCs/>
+        </w:rPr>
+        <w:t>n</w:t>
+      </w:r>
+      <w:r>
+        <w:rPr>
+          <w:b/>
+          <w:bCs/>
+        </w:rPr>
+        <w:t>se Plan</w:t>
       </w:r>
       <w:r>
         <w:rPr>
@@ -3164,7 +3190,23 @@
         <w:t>internal tool</w:t>
       </w:r>
       <w:r>
-        <w:t xml:space="preserve">, </w:t>
+        <w:t>,</w:t>
+      </w:r>
+      <w:r>
+        <w:t xml:space="preserve"> </w:t>
+      </w:r>
+      <w:r>
+        <w:rPr>
+          <w:b/>
+          <w:bCs/>
+        </w:rPr>
+        <w:t>supply chain</w:t>
+      </w:r>
+      <w:r>
+        <w:t>,</w:t>
+      </w:r>
+      <w:r>
+        <w:t xml:space="preserve"> </w:t>
       </w:r>
       <w:r>
         <w:rPr>
@@ -3513,7 +3555,6 @@
         <w:tc>
           <w:tcPr>
             <w:tcW w:w="1598" w:type="dxa"/>
-            <w:shd w:val="clear" w:color="auto" w:fill="auto"/>
             <w:tcMar>
               <w:top w:w="100" w:type="dxa"/>
               <w:left w:w="100" w:type="dxa"/>
@@ -3544,7 +3585,6 @@
         <w:tc>
           <w:tcPr>
             <w:tcW w:w="4332" w:type="dxa"/>
-            <w:shd w:val="clear" w:color="auto" w:fill="auto"/>
             <w:tcMar>
               <w:top w:w="100" w:type="dxa"/>
               <w:left w:w="100" w:type="dxa"/>
@@ -3570,7 +3610,6 @@
         <w:tc>
           <w:tcPr>
             <w:tcW w:w="1598" w:type="dxa"/>
-            <w:shd w:val="clear" w:color="auto" w:fill="auto"/>
             <w:tcMar>
               <w:top w:w="100" w:type="dxa"/>
               <w:left w:w="100" w:type="dxa"/>
@@ -3601,7 +3640,6 @@
         <w:tc>
           <w:tcPr>
             <w:tcW w:w="4332" w:type="dxa"/>
-            <w:shd w:val="clear" w:color="auto" w:fill="auto"/>
             <w:tcMar>
               <w:top w:w="100" w:type="dxa"/>
               <w:left w:w="100" w:type="dxa"/>
@@ -3624,7 +3662,6 @@
         <w:tc>
           <w:tcPr>
             <w:tcW w:w="1598" w:type="dxa"/>
-            <w:shd w:val="clear" w:color="auto" w:fill="auto"/>
             <w:tcMar>
               <w:top w:w="100" w:type="dxa"/>
               <w:left w:w="100" w:type="dxa"/>
@@ -3655,7 +3692,6 @@
         <w:tc>
           <w:tcPr>
             <w:tcW w:w="4332" w:type="dxa"/>
-            <w:shd w:val="clear" w:color="auto" w:fill="auto"/>
             <w:tcMar>
               <w:top w:w="100" w:type="dxa"/>
               <w:left w:w="100" w:type="dxa"/>
@@ -3932,138 +3968,13 @@
           <w:ilvl w:val="0"/>
           <w:numId w:val="6"/>
         </w:numPr>
-        <w:jc w:val="both"/>
-      </w:pPr>
-      <w:r>
-        <w:rPr>
-          <w:b/>
-          <w:bCs/>
-        </w:rPr>
-        <w:t>LEO Incident Submission Report</w:t>
-      </w:r>
-      <w:r>
-        <w:t xml:space="preserve"> (AVCDL tertiary document)</w:t>
-      </w:r>
-    </w:p>
-    <w:p>
-      <w:pPr>
-        <w:pStyle w:val="ListParagraph"/>
-        <w:numPr>
-          <w:ilvl w:val="0"/>
-          <w:numId w:val="6"/>
-        </w:numPr>
-        <w:jc w:val="both"/>
-      </w:pPr>
-      <w:r>
-        <w:rPr>
-          <w:b/>
-          <w:bCs/>
-        </w:rPr>
-        <w:t>Published Exposure Determination Report</w:t>
-      </w:r>
-      <w:r>
-        <w:t xml:space="preserve"> (AVCDL tertiary document)</w:t>
-      </w:r>
-    </w:p>
-    <w:p>
-      <w:pPr>
-        <w:pStyle w:val="ListParagraph"/>
-        <w:numPr>
-          <w:ilvl w:val="0"/>
-          <w:numId w:val="6"/>
-        </w:numPr>
-        <w:jc w:val="both"/>
-      </w:pPr>
-      <w:r>
-        <w:rPr>
-          <w:b/>
-          <w:bCs/>
-        </w:rPr>
-        <w:t>Unpublished Vulnerability Submission Report</w:t>
-      </w:r>
-      <w:r>
-        <w:t xml:space="preserve"> (AVCDL tertiary document)</w:t>
-      </w:r>
-    </w:p>
-    <w:p>
-      <w:pPr>
-        <w:pStyle w:val="ListParagraph"/>
-        <w:numPr>
-          <w:ilvl w:val="0"/>
-          <w:numId w:val="6"/>
-        </w:numPr>
-        <w:jc w:val="both"/>
-      </w:pPr>
-      <w:r>
-        <w:rPr>
-          <w:b/>
-          <w:bCs/>
-        </w:rPr>
-        <w:t>Incident Candidate Ingest Report</w:t>
-      </w:r>
-      <w:r>
-        <w:t xml:space="preserve"> (AVCDL tertiary document)</w:t>
-      </w:r>
-    </w:p>
-    <w:p>
-      <w:pPr>
-        <w:pStyle w:val="ListParagraph"/>
-        <w:numPr>
-          <w:ilvl w:val="0"/>
-          <w:numId w:val="6"/>
-        </w:numPr>
-        <w:jc w:val="both"/>
-      </w:pPr>
-      <w:r>
-        <w:rPr>
-          <w:b/>
-          <w:bCs/>
-        </w:rPr>
-        <w:t>Cybersecurity Monitoring Summary Report</w:t>
-      </w:r>
-      <w:r>
-        <w:t xml:space="preserve"> (AVCDL tertiary document)</w:t>
-      </w:r>
-    </w:p>
-    <w:p>
-      <w:pPr>
-        <w:pStyle w:val="ListParagraph"/>
-        <w:numPr>
-          <w:ilvl w:val="0"/>
-          <w:numId w:val="6"/>
-        </w:numPr>
-        <w:rPr>
-          <w:b/>
-          <w:bCs/>
-          <w:lang w:val="en-US"/>
-        </w:rPr>
-      </w:pPr>
-      <w:r>
-        <w:rPr>
-          <w:b/>
-          <w:bCs/>
-        </w:rPr>
-        <w:t>ISO 8601:</w:t>
-      </w:r>
-      <w:r>
-        <w:rPr>
-          <w:rFonts w:eastAsia="Times New Roman"/>
-          <w:i/>
-          <w:iCs/>
-          <w:color w:val="202122"/>
-          <w:sz w:val="21"/>
-          <w:szCs w:val="21"/>
-          <w:lang w:val="en-US"/>
-        </w:rPr>
-        <w:t xml:space="preserve"> </w:t>
-      </w:r>
-      <w:r>
-        <w:rPr>
-          <w:b/>
-          <w:bCs/>
-          <w:lang w:val="en-US"/>
-        </w:rPr>
-        <w:t>Data elements and interchange formats – Information interchange – Representation of dates and times</w:t>
+      </w:pPr>
+      <w:r>
+        <w:rPr>
+          <w:b/>
+          <w:bCs/>
+        </w:rPr>
+        <w:t>Starting A Vulnerability Disclosure Program</w:t>
       </w:r>
       <w:r>
         <w:rPr>
@@ -4073,95 +3984,6 @@
         <w:br/>
       </w:r>
       <w:hyperlink r:id="rId17" w:history="1">
-        <w:r>
-          <w:rPr>
-            <w:rStyle w:val="Hyperlink"/>
-            <w:rFonts w:ascii="Courier New" w:hAnsi="Courier New" w:cs="Courier New"/>
-            <w:b/>
-            <w:bCs/>
-            <w:sz w:val="20"/>
-            <w:szCs w:val="20"/>
-          </w:rPr>
-          <w:t>https://en.wikipedia.org/wiki/ISO_8601</w:t>
-        </w:r>
-      </w:hyperlink>
-    </w:p>
-    <w:p>
-      <w:pPr>
-        <w:pStyle w:val="ListParagraph"/>
-        <w:numPr>
-          <w:ilvl w:val="0"/>
-          <w:numId w:val="6"/>
-        </w:numPr>
-        <w:rPr>
-          <w:b/>
-          <w:bCs/>
-          <w:lang w:val="en-US"/>
-        </w:rPr>
-      </w:pPr>
-      <w:r>
-        <w:rPr>
-          <w:b/>
-          <w:bCs/>
-        </w:rPr>
-        <w:t>List of Approved Tools</w:t>
-      </w:r>
-      <w:r>
-        <w:t xml:space="preserve"> (AVCDL secondary document)</w:t>
-      </w:r>
-    </w:p>
-    <w:p>
-      <w:pPr>
-        <w:pStyle w:val="ListParagraph"/>
-        <w:numPr>
-          <w:ilvl w:val="0"/>
-          <w:numId w:val="6"/>
-        </w:numPr>
-        <w:rPr>
-          <w:b/>
-          <w:bCs/>
-          <w:lang w:val="en-US"/>
-        </w:rPr>
-      </w:pPr>
-      <w:r>
-        <w:rPr>
-          <w:b/>
-          <w:bCs/>
-        </w:rPr>
-        <w:t>Component / Version - Product / Version Cross-reference</w:t>
-      </w:r>
-      <w:r>
-        <w:t xml:space="preserve"> (AVCDL secondary document)</w:t>
-      </w:r>
-    </w:p>
-    <w:p>
-      <w:pPr>
-        <w:pStyle w:val="ListParagraph"/>
-        <w:numPr>
-          <w:ilvl w:val="0"/>
-          <w:numId w:val="6"/>
-        </w:numPr>
-        <w:rPr>
-          <w:b/>
-          <w:bCs/>
-          <w:lang w:val="en-US"/>
-        </w:rPr>
-      </w:pPr>
-      <w:r>
-        <w:rPr>
-          <w:b/>
-          <w:bCs/>
-        </w:rPr>
-        <w:t>Starting A Vulnerability Disclosure Program</w:t>
-      </w:r>
-      <w:r>
-        <w:rPr>
-          <w:b/>
-          <w:bCs/>
-        </w:rPr>
-        <w:br/>
-      </w:r>
-      <w:hyperlink r:id="rId18" w:history="1">
         <w:r>
           <w:rPr>
             <w:rStyle w:val="Hyperlink"/>
@@ -4175,6 +3997,195 @@
           <w:t>https://developers.google.com/android/play-protect/starting-a-vdp</w:t>
         </w:r>
       </w:hyperlink>
+    </w:p>
+    <w:p>
+      <w:pPr>
+        <w:pStyle w:val="ListParagraph"/>
+        <w:numPr>
+          <w:ilvl w:val="0"/>
+          <w:numId w:val="6"/>
+        </w:numPr>
+        <w:jc w:val="both"/>
+      </w:pPr>
+      <w:r>
+        <w:rPr>
+          <w:b/>
+          <w:bCs/>
+        </w:rPr>
+        <w:t>Published Exposure Determination Report</w:t>
+      </w:r>
+      <w:r>
+        <w:t xml:space="preserve"> (AVCDL tertiary document)</w:t>
+      </w:r>
+    </w:p>
+    <w:p>
+      <w:pPr>
+        <w:pStyle w:val="ListParagraph"/>
+        <w:numPr>
+          <w:ilvl w:val="0"/>
+          <w:numId w:val="6"/>
+        </w:numPr>
+        <w:jc w:val="both"/>
+      </w:pPr>
+      <w:r>
+        <w:rPr>
+          <w:b/>
+          <w:bCs/>
+        </w:rPr>
+        <w:t>Unpublished Vulnerability Submission Report</w:t>
+      </w:r>
+      <w:r>
+        <w:t xml:space="preserve"> (AVCDL tertiary document)</w:t>
+      </w:r>
+    </w:p>
+    <w:p>
+      <w:pPr>
+        <w:pStyle w:val="ListParagraph"/>
+        <w:numPr>
+          <w:ilvl w:val="0"/>
+          <w:numId w:val="6"/>
+        </w:numPr>
+        <w:jc w:val="both"/>
+      </w:pPr>
+      <w:r>
+        <w:rPr>
+          <w:b/>
+          <w:bCs/>
+        </w:rPr>
+        <w:t>Incident Candidate Ingest Report</w:t>
+      </w:r>
+      <w:r>
+        <w:t xml:space="preserve"> (AVCDL tertiary document)</w:t>
+      </w:r>
+    </w:p>
+    <w:p>
+      <w:pPr>
+        <w:pStyle w:val="ListParagraph"/>
+        <w:numPr>
+          <w:ilvl w:val="0"/>
+          <w:numId w:val="6"/>
+        </w:numPr>
+        <w:jc w:val="both"/>
+      </w:pPr>
+      <w:r>
+        <w:rPr>
+          <w:b/>
+          <w:bCs/>
+        </w:rPr>
+        <w:t>Cybersecurity Monitoring Summary Report</w:t>
+      </w:r>
+      <w:r>
+        <w:t xml:space="preserve"> (AVCDL tertiary document)</w:t>
+      </w:r>
+    </w:p>
+    <w:p>
+      <w:pPr>
+        <w:pStyle w:val="ListParagraph"/>
+        <w:numPr>
+          <w:ilvl w:val="0"/>
+          <w:numId w:val="6"/>
+        </w:numPr>
+        <w:rPr>
+          <w:b/>
+          <w:bCs/>
+          <w:lang w:val="en-US"/>
+        </w:rPr>
+      </w:pPr>
+      <w:r>
+        <w:rPr>
+          <w:b/>
+          <w:bCs/>
+        </w:rPr>
+        <w:t>ISO 8601:</w:t>
+      </w:r>
+      <w:r>
+        <w:rPr>
+          <w:rFonts w:eastAsia="Times New Roman"/>
+          <w:i/>
+          <w:iCs/>
+          <w:color w:val="202122"/>
+          <w:sz w:val="21"/>
+          <w:szCs w:val="21"/>
+          <w:lang w:val="en-US"/>
+        </w:rPr>
+        <w:t xml:space="preserve"> </w:t>
+      </w:r>
+      <w:r>
+        <w:rPr>
+          <w:b/>
+          <w:bCs/>
+          <w:lang w:val="en-US"/>
+        </w:rPr>
+        <w:t>Data elements and interchange formats – Information interchange – Representation of dates and times</w:t>
+      </w:r>
+      <w:r>
+        <w:rPr>
+          <w:b/>
+          <w:bCs/>
+        </w:rPr>
+        <w:br/>
+      </w:r>
+      <w:hyperlink r:id="rId18" w:history="1">
+        <w:r>
+          <w:rPr>
+            <w:rStyle w:val="Hyperlink"/>
+            <w:rFonts w:ascii="Courier New" w:hAnsi="Courier New" w:cs="Courier New"/>
+            <w:b/>
+            <w:bCs/>
+            <w:sz w:val="20"/>
+            <w:szCs w:val="20"/>
+          </w:rPr>
+          <w:t>https://en.wikipedia.org/wiki/ISO_8601</w:t>
+        </w:r>
+      </w:hyperlink>
+    </w:p>
+    <w:p>
+      <w:pPr>
+        <w:pStyle w:val="ListParagraph"/>
+        <w:numPr>
+          <w:ilvl w:val="0"/>
+          <w:numId w:val="6"/>
+        </w:numPr>
+        <w:rPr>
+          <w:b/>
+          <w:bCs/>
+          <w:lang w:val="en-US"/>
+        </w:rPr>
+      </w:pPr>
+      <w:r>
+        <w:rPr>
+          <w:b/>
+          <w:bCs/>
+        </w:rPr>
+        <w:t>List of Approved Tools</w:t>
+      </w:r>
+      <w:r>
+        <w:t xml:space="preserve"> (AVCDL secondary document)</w:t>
+      </w:r>
+    </w:p>
+    <w:p>
+      <w:pPr>
+        <w:pStyle w:val="ListParagraph"/>
+        <w:numPr>
+          <w:ilvl w:val="0"/>
+          <w:numId w:val="6"/>
+        </w:numPr>
+        <w:rPr>
+          <w:b/>
+          <w:bCs/>
+          <w:lang w:val="en-US"/>
+        </w:rPr>
+      </w:pPr>
+      <w:r>
+        <w:rPr>
+          <w:b/>
+          <w:bCs/>
+        </w:rPr>
+        <w:t>Component / Version - Product / Version Cross-reference</w:t>
+      </w:r>
+      <w:r>
+        <w:t xml:space="preserve"> (AVCDL secondary document)</w:t>
+      </w:r>
     </w:p>
     <w:p>
       <w:pPr>
@@ -4212,7 +4223,7 @@
 </file>
 
 <file path=word/endnotes.xml><?xml version="1.0" encoding="utf-8"?>
-<w:endnotes xmlns:wpc="http://schemas.microsoft.com/office/word/2010/wordprocessingCanvas" xmlns:cx="http://schemas.microsoft.com/office/drawing/2014/chartex" xmlns:cx1="http://schemas.microsoft.com/office/drawing/2015/9/8/chartex" xmlns:cx2="http://schemas.microsoft.com/office/drawing/2015/10/21/chartex" xmlns:cx3="http://schemas.microsoft.com/office/drawing/2016/5/9/chartex" xmlns:cx4="http://schemas.microsoft.com/office/drawing/2016/5/10/chartex" xmlns:cx5="http://schemas.microsoft.com/office/drawing/2016/5/11/chartex" xmlns:cx6="http://schemas.microsoft.com/office/drawing/2016/5/12/chartex" xmlns:cx7="http://schemas.microsoft.com/office/drawing/2016/5/13/chartex" xmlns:cx8="http://schemas.microsoft.com/office/drawing/2016/5/14/chartex" xmlns:mc="http://schemas.openxmlformats.org/markup-compatibility/2006" xmlns:aink="http://schemas.microsoft.com/office/drawing/2016/ink" xmlns:am3d="http://schemas.microsoft.com/office/drawing/2017/model3d" xmlns:o="urn:schemas-microsoft-com:office:office" xmlns:oel="http://schemas.microsoft.com/office/2019/extlst" xmlns:r="http://schemas.openxmlformats.org/officeDocument/2006/relationships" xmlns:m="http://schemas.openxmlformats.org/officeDocument/2006/math" xmlns:v="urn:schemas-microsoft-com:vml" xmlns:wp14="http://schemas.microsoft.com/office/word/2010/wordprocessingDrawing" xmlns:wp="http://schemas.openxmlformats.org/drawingml/2006/wordprocessingDrawing" xmlns:w10="urn:schemas-microsoft-com:office:word" xmlns:w="http://schemas.openxmlformats.org/wordprocessingml/2006/main" xmlns:w14="http://schemas.microsoft.com/office/word/2010/wordml" xmlns:w15="http://schemas.microsoft.com/office/word/2012/wordml" xmlns:w16cex="http://schemas.microsoft.com/office/word/2018/wordml/cex" xmlns:w16cid="http://schemas.microsoft.com/office/word/2016/wordml/cid" xmlns:w16="http://schemas.microsoft.com/office/word/2018/wordml" xmlns:w16sdtdh="http://schemas.microsoft.com/office/word/2020/wordml/sdtdatahash" xmlns:w16se="http://schemas.microsoft.com/office/word/2015/wordml/symex" xmlns:wpg="http://schemas.microsoft.com/office/word/2010/wordprocessingGroup" xmlns:wpi="http://schemas.microsoft.com/office/word/2010/wordprocessingInk" xmlns:wne="http://schemas.microsoft.com/office/word/2006/wordml" xmlns:wps="http://schemas.microsoft.com/office/word/2010/wordprocessingShape" mc:Ignorable="w14 w15 w16se w16cid w16 w16cex w16sdtdh wp14">
+<w:endnotes xmlns:wpc="http://schemas.microsoft.com/office/word/2010/wordprocessingCanvas" xmlns:cx="http://schemas.microsoft.com/office/drawing/2014/chartex" xmlns:cx1="http://schemas.microsoft.com/office/drawing/2015/9/8/chartex" xmlns:cx2="http://schemas.microsoft.com/office/drawing/2015/10/21/chartex" xmlns:cx3="http://schemas.microsoft.com/office/drawing/2016/5/9/chartex" xmlns:cx4="http://schemas.microsoft.com/office/drawing/2016/5/10/chartex" xmlns:cx5="http://schemas.microsoft.com/office/drawing/2016/5/11/chartex" xmlns:cx6="http://schemas.microsoft.com/office/drawing/2016/5/12/chartex" xmlns:cx7="http://schemas.microsoft.com/office/drawing/2016/5/13/chartex" xmlns:cx8="http://schemas.microsoft.com/office/drawing/2016/5/14/chartex" xmlns:mc="http://schemas.openxmlformats.org/markup-compatibility/2006" xmlns:aink="http://schemas.microsoft.com/office/drawing/2016/ink" xmlns:am3d="http://schemas.microsoft.com/office/drawing/2017/model3d" xmlns:o="urn:schemas-microsoft-com:office:office" xmlns:oel="http://schemas.microsoft.com/office/2019/extlst" xmlns:r="http://schemas.openxmlformats.org/officeDocument/2006/relationships" xmlns:m="http://schemas.openxmlformats.org/officeDocument/2006/math" xmlns:v="urn:schemas-microsoft-com:vml" xmlns:wp14="http://schemas.microsoft.com/office/word/2010/wordprocessingDrawing" xmlns:wp="http://schemas.openxmlformats.org/drawingml/2006/wordprocessingDrawing" xmlns:w10="urn:schemas-microsoft-com:office:word" xmlns:w="http://schemas.openxmlformats.org/wordprocessingml/2006/main" xmlns:w14="http://schemas.microsoft.com/office/word/2010/wordml" xmlns:w15="http://schemas.microsoft.com/office/word/2012/wordml" xmlns:w16cex="http://schemas.microsoft.com/office/word/2018/wordml/cex" xmlns:w16cid="http://schemas.microsoft.com/office/word/2016/wordml/cid" xmlns:w16="http://schemas.microsoft.com/office/word/2018/wordml" xmlns:w16du="http://schemas.microsoft.com/office/word/2023/wordml/word16du" xmlns:w16sdtdh="http://schemas.microsoft.com/office/word/2020/wordml/sdtdatahash" xmlns:w16sdtfl="http://schemas.microsoft.com/office/word/2024/wordml/sdtformatlock" xmlns:w16se="http://schemas.microsoft.com/office/word/2015/wordml/symex" xmlns:wpg="http://schemas.microsoft.com/office/word/2010/wordprocessingGroup" xmlns:wpi="http://schemas.microsoft.com/office/word/2010/wordprocessingInk" xmlns:wne="http://schemas.microsoft.com/office/word/2006/wordml" xmlns:wps="http://schemas.microsoft.com/office/word/2010/wordprocessingShape" mc:Ignorable="w14 w15 w16se w16cid w16 w16cex w16sdtdh w16sdtfl w16du wp14">
   <w:endnote w:type="separator" w:id="-1">
     <w:p>
       <w:pPr>
@@ -4237,7 +4248,7 @@
 </file>
 
 <file path=word/footer1.xml><?xml version="1.0" encoding="utf-8"?>
-<w:ftr xmlns:wpc="http://schemas.microsoft.com/office/word/2010/wordprocessingCanvas" xmlns:cx="http://schemas.microsoft.com/office/drawing/2014/chartex" xmlns:cx1="http://schemas.microsoft.com/office/drawing/2015/9/8/chartex" xmlns:cx2="http://schemas.microsoft.com/office/drawing/2015/10/21/chartex" xmlns:cx3="http://schemas.microsoft.com/office/drawing/2016/5/9/chartex" xmlns:cx4="http://schemas.microsoft.com/office/drawing/2016/5/10/chartex" xmlns:cx5="http://schemas.microsoft.com/office/drawing/2016/5/11/chartex" xmlns:cx6="http://schemas.microsoft.com/office/drawing/2016/5/12/chartex" xmlns:cx7="http://schemas.microsoft.com/office/drawing/2016/5/13/chartex" xmlns:cx8="http://schemas.microsoft.com/office/drawing/2016/5/14/chartex" xmlns:mc="http://schemas.openxmlformats.org/markup-compatibility/2006" xmlns:aink="http://schemas.microsoft.com/office/drawing/2016/ink" xmlns:am3d="http://schemas.microsoft.com/office/drawing/2017/model3d" xmlns:o="urn:schemas-microsoft-com:office:office" xmlns:oel="http://schemas.microsoft.com/office/2019/extlst" xmlns:r="http://schemas.openxmlformats.org/officeDocument/2006/relationships" xmlns:m="http://schemas.openxmlformats.org/officeDocument/2006/math" xmlns:v="urn:schemas-microsoft-com:vml" xmlns:wp14="http://schemas.microsoft.com/office/word/2010/wordprocessingDrawing" xmlns:wp="http://schemas.openxmlformats.org/drawingml/2006/wordprocessingDrawing" xmlns:w10="urn:schemas-microsoft-com:office:word" xmlns:w="http://schemas.openxmlformats.org/wordprocessingml/2006/main" xmlns:w14="http://schemas.microsoft.com/office/word/2010/wordml" xmlns:w15="http://schemas.microsoft.com/office/word/2012/wordml" xmlns:w16cex="http://schemas.microsoft.com/office/word/2018/wordml/cex" xmlns:w16cid="http://schemas.microsoft.com/office/word/2016/wordml/cid" xmlns:w16="http://schemas.microsoft.com/office/word/2018/wordml" xmlns:w16sdtdh="http://schemas.microsoft.com/office/word/2020/wordml/sdtdatahash" xmlns:w16se="http://schemas.microsoft.com/office/word/2015/wordml/symex" xmlns:wpg="http://schemas.microsoft.com/office/word/2010/wordprocessingGroup" xmlns:wpi="http://schemas.microsoft.com/office/word/2010/wordprocessingInk" xmlns:wne="http://schemas.microsoft.com/office/word/2006/wordml" xmlns:wps="http://schemas.microsoft.com/office/word/2010/wordprocessingShape" mc:Ignorable="w14 w15 w16se w16cid w16 w16cex w16sdtdh wp14">
+<w:ftr xmlns:wpc="http://schemas.microsoft.com/office/word/2010/wordprocessingCanvas" xmlns:cx="http://schemas.microsoft.com/office/drawing/2014/chartex" xmlns:cx1="http://schemas.microsoft.com/office/drawing/2015/9/8/chartex" xmlns:cx2="http://schemas.microsoft.com/office/drawing/2015/10/21/chartex" xmlns:cx3="http://schemas.microsoft.com/office/drawing/2016/5/9/chartex" xmlns:cx4="http://schemas.microsoft.com/office/drawing/2016/5/10/chartex" xmlns:cx5="http://schemas.microsoft.com/office/drawing/2016/5/11/chartex" xmlns:cx6="http://schemas.microsoft.com/office/drawing/2016/5/12/chartex" xmlns:cx7="http://schemas.microsoft.com/office/drawing/2016/5/13/chartex" xmlns:cx8="http://schemas.microsoft.com/office/drawing/2016/5/14/chartex" xmlns:mc="http://schemas.openxmlformats.org/markup-compatibility/2006" xmlns:aink="http://schemas.microsoft.com/office/drawing/2016/ink" xmlns:am3d="http://schemas.microsoft.com/office/drawing/2017/model3d" xmlns:o="urn:schemas-microsoft-com:office:office" xmlns:oel="http://schemas.microsoft.com/office/2019/extlst" xmlns:r="http://schemas.openxmlformats.org/officeDocument/2006/relationships" xmlns:m="http://schemas.openxmlformats.org/officeDocument/2006/math" xmlns:v="urn:schemas-microsoft-com:vml" xmlns:wp14="http://schemas.microsoft.com/office/word/2010/wordprocessingDrawing" xmlns:wp="http://schemas.openxmlformats.org/drawingml/2006/wordprocessingDrawing" xmlns:w10="urn:schemas-microsoft-com:office:word" xmlns:w="http://schemas.openxmlformats.org/wordprocessingml/2006/main" xmlns:w14="http://schemas.microsoft.com/office/word/2010/wordml" xmlns:w15="http://schemas.microsoft.com/office/word/2012/wordml" xmlns:w16cex="http://schemas.microsoft.com/office/word/2018/wordml/cex" xmlns:w16cid="http://schemas.microsoft.com/office/word/2016/wordml/cid" xmlns:w16="http://schemas.microsoft.com/office/word/2018/wordml" xmlns:w16du="http://schemas.microsoft.com/office/word/2023/wordml/word16du" xmlns:w16sdtdh="http://schemas.microsoft.com/office/word/2020/wordml/sdtdatahash" xmlns:w16sdtfl="http://schemas.microsoft.com/office/word/2024/wordml/sdtformatlock" xmlns:w16se="http://schemas.microsoft.com/office/word/2015/wordml/symex" xmlns:wpg="http://schemas.microsoft.com/office/word/2010/wordprocessingGroup" xmlns:wpi="http://schemas.microsoft.com/office/word/2010/wordprocessingInk" xmlns:wne="http://schemas.microsoft.com/office/word/2006/wordml" xmlns:wps="http://schemas.microsoft.com/office/word/2010/wordprocessingShape" mc:Ignorable="w14 w15 w16se w16cid w16 w16cex w16sdtdh w16sdtfl w16du wp14">
   <w:sdt>
     <w:sdtPr>
       <w:rPr>
@@ -4289,7 +4300,7 @@
 </file>
 
 <file path=word/footer2.xml><?xml version="1.0" encoding="utf-8"?>
-<w:ftr xmlns:wpc="http://schemas.microsoft.com/office/word/2010/wordprocessingCanvas" xmlns:cx="http://schemas.microsoft.com/office/drawing/2014/chartex" xmlns:cx1="http://schemas.microsoft.com/office/drawing/2015/9/8/chartex" xmlns:cx2="http://schemas.microsoft.com/office/drawing/2015/10/21/chartex" xmlns:cx3="http://schemas.microsoft.com/office/drawing/2016/5/9/chartex" xmlns:cx4="http://schemas.microsoft.com/office/drawing/2016/5/10/chartex" xmlns:cx5="http://schemas.microsoft.com/office/drawing/2016/5/11/chartex" xmlns:cx6="http://schemas.microsoft.com/office/drawing/2016/5/12/chartex" xmlns:cx7="http://schemas.microsoft.com/office/drawing/2016/5/13/chartex" xmlns:cx8="http://schemas.microsoft.com/office/drawing/2016/5/14/chartex" xmlns:mc="http://schemas.openxmlformats.org/markup-compatibility/2006" xmlns:aink="http://schemas.microsoft.com/office/drawing/2016/ink" xmlns:am3d="http://schemas.microsoft.com/office/drawing/2017/model3d" xmlns:o="urn:schemas-microsoft-com:office:office" xmlns:oel="http://schemas.microsoft.com/office/2019/extlst" xmlns:r="http://schemas.openxmlformats.org/officeDocument/2006/relationships" xmlns:m="http://schemas.openxmlformats.org/officeDocument/2006/math" xmlns:v="urn:schemas-microsoft-com:vml" xmlns:wp14="http://schemas.microsoft.com/office/word/2010/wordprocessingDrawing" xmlns:wp="http://schemas.openxmlformats.org/drawingml/2006/wordprocessingDrawing" xmlns:w10="urn:schemas-microsoft-com:office:word" xmlns:w="http://schemas.openxmlformats.org/wordprocessingml/2006/main" xmlns:w14="http://schemas.microsoft.com/office/word/2010/wordml" xmlns:w15="http://schemas.microsoft.com/office/word/2012/wordml" xmlns:w16cex="http://schemas.microsoft.com/office/word/2018/wordml/cex" xmlns:w16cid="http://schemas.microsoft.com/office/word/2016/wordml/cid" xmlns:w16="http://schemas.microsoft.com/office/word/2018/wordml" xmlns:w16sdtdh="http://schemas.microsoft.com/office/word/2020/wordml/sdtdatahash" xmlns:w16se="http://schemas.microsoft.com/office/word/2015/wordml/symex" xmlns:wpg="http://schemas.microsoft.com/office/word/2010/wordprocessingGroup" xmlns:wpi="http://schemas.microsoft.com/office/word/2010/wordprocessingInk" xmlns:wne="http://schemas.microsoft.com/office/word/2006/wordml" xmlns:wps="http://schemas.microsoft.com/office/word/2010/wordprocessingShape" mc:Ignorable="w14 w15 w16se w16cid w16 w16cex w16sdtdh wp14">
+<w:ftr xmlns:wpc="http://schemas.microsoft.com/office/word/2010/wordprocessingCanvas" xmlns:cx="http://schemas.microsoft.com/office/drawing/2014/chartex" xmlns:cx1="http://schemas.microsoft.com/office/drawing/2015/9/8/chartex" xmlns:cx2="http://schemas.microsoft.com/office/drawing/2015/10/21/chartex" xmlns:cx3="http://schemas.microsoft.com/office/drawing/2016/5/9/chartex" xmlns:cx4="http://schemas.microsoft.com/office/drawing/2016/5/10/chartex" xmlns:cx5="http://schemas.microsoft.com/office/drawing/2016/5/11/chartex" xmlns:cx6="http://schemas.microsoft.com/office/drawing/2016/5/12/chartex" xmlns:cx7="http://schemas.microsoft.com/office/drawing/2016/5/13/chartex" xmlns:cx8="http://schemas.microsoft.com/office/drawing/2016/5/14/chartex" xmlns:mc="http://schemas.openxmlformats.org/markup-compatibility/2006" xmlns:aink="http://schemas.microsoft.com/office/drawing/2016/ink" xmlns:am3d="http://schemas.microsoft.com/office/drawing/2017/model3d" xmlns:o="urn:schemas-microsoft-com:office:office" xmlns:oel="http://schemas.microsoft.com/office/2019/extlst" xmlns:r="http://schemas.openxmlformats.org/officeDocument/2006/relationships" xmlns:m="http://schemas.openxmlformats.org/officeDocument/2006/math" xmlns:v="urn:schemas-microsoft-com:vml" xmlns:wp14="http://schemas.microsoft.com/office/word/2010/wordprocessingDrawing" xmlns:wp="http://schemas.openxmlformats.org/drawingml/2006/wordprocessingDrawing" xmlns:w10="urn:schemas-microsoft-com:office:word" xmlns:w="http://schemas.openxmlformats.org/wordprocessingml/2006/main" xmlns:w14="http://schemas.microsoft.com/office/word/2010/wordml" xmlns:w15="http://schemas.microsoft.com/office/word/2012/wordml" xmlns:w16cex="http://schemas.microsoft.com/office/word/2018/wordml/cex" xmlns:w16cid="http://schemas.microsoft.com/office/word/2016/wordml/cid" xmlns:w16="http://schemas.microsoft.com/office/word/2018/wordml" xmlns:w16du="http://schemas.microsoft.com/office/word/2023/wordml/word16du" xmlns:w16sdtdh="http://schemas.microsoft.com/office/word/2020/wordml/sdtdatahash" xmlns:w16sdtfl="http://schemas.microsoft.com/office/word/2024/wordml/sdtformatlock" xmlns:w16se="http://schemas.microsoft.com/office/word/2015/wordml/symex" xmlns:wpg="http://schemas.microsoft.com/office/word/2010/wordprocessingGroup" xmlns:wpi="http://schemas.microsoft.com/office/word/2010/wordprocessingInk" xmlns:wne="http://schemas.microsoft.com/office/word/2006/wordml" xmlns:wps="http://schemas.microsoft.com/office/word/2010/wordprocessingShape" mc:Ignorable="w14 w15 w16se w16cid w16 w16cex w16sdtdh w16sdtfl w16du wp14">
   <w:sdt>
     <w:sdtPr>
       <w:rPr>
@@ -4354,7 +4365,7 @@
 </file>
 
 <file path=word/footnotes.xml><?xml version="1.0" encoding="utf-8"?>
-<w:footnotes xmlns:wpc="http://schemas.microsoft.com/office/word/2010/wordprocessingCanvas" xmlns:cx="http://schemas.microsoft.com/office/drawing/2014/chartex" xmlns:cx1="http://schemas.microsoft.com/office/drawing/2015/9/8/chartex" xmlns:cx2="http://schemas.microsoft.com/office/drawing/2015/10/21/chartex" xmlns:cx3="http://schemas.microsoft.com/office/drawing/2016/5/9/chartex" xmlns:cx4="http://schemas.microsoft.com/office/drawing/2016/5/10/chartex" xmlns:cx5="http://schemas.microsoft.com/office/drawing/2016/5/11/chartex" xmlns:cx6="http://schemas.microsoft.com/office/drawing/2016/5/12/chartex" xmlns:cx7="http://schemas.microsoft.com/office/drawing/2016/5/13/chartex" xmlns:cx8="http://schemas.microsoft.com/office/drawing/2016/5/14/chartex" xmlns:mc="http://schemas.openxmlformats.org/markup-compatibility/2006" xmlns:aink="http://schemas.microsoft.com/office/drawing/2016/ink" xmlns:am3d="http://schemas.microsoft.com/office/drawing/2017/model3d" xmlns:o="urn:schemas-microsoft-com:office:office" xmlns:oel="http://schemas.microsoft.com/office/2019/extlst" xmlns:r="http://schemas.openxmlformats.org/officeDocument/2006/relationships" xmlns:m="http://schemas.openxmlformats.org/officeDocument/2006/math" xmlns:v="urn:schemas-microsoft-com:vml" xmlns:wp14="http://schemas.microsoft.com/office/word/2010/wordprocessingDrawing" xmlns:wp="http://schemas.openxmlformats.org/drawingml/2006/wordprocessingDrawing" xmlns:w10="urn:schemas-microsoft-com:office:word" xmlns:w="http://schemas.openxmlformats.org/wordprocessingml/2006/main" xmlns:w14="http://schemas.microsoft.com/office/word/2010/wordml" xmlns:w15="http://schemas.microsoft.com/office/word/2012/wordml" xmlns:w16cex="http://schemas.microsoft.com/office/word/2018/wordml/cex" xmlns:w16cid="http://schemas.microsoft.com/office/word/2016/wordml/cid" xmlns:w16="http://schemas.microsoft.com/office/word/2018/wordml" xmlns:w16sdtdh="http://schemas.microsoft.com/office/word/2020/wordml/sdtdatahash" xmlns:w16se="http://schemas.microsoft.com/office/word/2015/wordml/symex" xmlns:wpg="http://schemas.microsoft.com/office/word/2010/wordprocessingGroup" xmlns:wpi="http://schemas.microsoft.com/office/word/2010/wordprocessingInk" xmlns:wne="http://schemas.microsoft.com/office/word/2006/wordml" xmlns:wps="http://schemas.microsoft.com/office/word/2010/wordprocessingShape" mc:Ignorable="w14 w15 w16se w16cid w16 w16cex w16sdtdh wp14">
+<w:footnotes xmlns:wpc="http://schemas.microsoft.com/office/word/2010/wordprocessingCanvas" xmlns:cx="http://schemas.microsoft.com/office/drawing/2014/chartex" xmlns:cx1="http://schemas.microsoft.com/office/drawing/2015/9/8/chartex" xmlns:cx2="http://schemas.microsoft.com/office/drawing/2015/10/21/chartex" xmlns:cx3="http://schemas.microsoft.com/office/drawing/2016/5/9/chartex" xmlns:cx4="http://schemas.microsoft.com/office/drawing/2016/5/10/chartex" xmlns:cx5="http://schemas.microsoft.com/office/drawing/2016/5/11/chartex" xmlns:cx6="http://schemas.microsoft.com/office/drawing/2016/5/12/chartex" xmlns:cx7="http://schemas.microsoft.com/office/drawing/2016/5/13/chartex" xmlns:cx8="http://schemas.microsoft.com/office/drawing/2016/5/14/chartex" xmlns:mc="http://schemas.openxmlformats.org/markup-compatibility/2006" xmlns:aink="http://schemas.microsoft.com/office/drawing/2016/ink" xmlns:am3d="http://schemas.microsoft.com/office/drawing/2017/model3d" xmlns:o="urn:schemas-microsoft-com:office:office" xmlns:oel="http://schemas.microsoft.com/office/2019/extlst" xmlns:r="http://schemas.openxmlformats.org/officeDocument/2006/relationships" xmlns:m="http://schemas.openxmlformats.org/officeDocument/2006/math" xmlns:v="urn:schemas-microsoft-com:vml" xmlns:wp14="http://schemas.microsoft.com/office/word/2010/wordprocessingDrawing" xmlns:wp="http://schemas.openxmlformats.org/drawingml/2006/wordprocessingDrawing" xmlns:w10="urn:schemas-microsoft-com:office:word" xmlns:w="http://schemas.openxmlformats.org/wordprocessingml/2006/main" xmlns:w14="http://schemas.microsoft.com/office/word/2010/wordml" xmlns:w15="http://schemas.microsoft.com/office/word/2012/wordml" xmlns:w16cex="http://schemas.microsoft.com/office/word/2018/wordml/cex" xmlns:w16cid="http://schemas.microsoft.com/office/word/2016/wordml/cid" xmlns:w16="http://schemas.microsoft.com/office/word/2018/wordml" xmlns:w16du="http://schemas.microsoft.com/office/word/2023/wordml/word16du" xmlns:w16sdtdh="http://schemas.microsoft.com/office/word/2020/wordml/sdtdatahash" xmlns:w16sdtfl="http://schemas.microsoft.com/office/word/2024/wordml/sdtformatlock" xmlns:w16se="http://schemas.microsoft.com/office/word/2015/wordml/symex" xmlns:wpg="http://schemas.microsoft.com/office/word/2010/wordprocessingGroup" xmlns:wpi="http://schemas.microsoft.com/office/word/2010/wordprocessingInk" xmlns:wne="http://schemas.microsoft.com/office/word/2006/wordml" xmlns:wps="http://schemas.microsoft.com/office/word/2010/wordprocessingShape" mc:Ignorable="w14 w15 w16se w16cid w16 w16cex w16sdtdh w16sdtfl w16du wp14">
   <w:footnote w:type="separator" w:id="-1">
     <w:p>
       <w:pPr>
@@ -4379,7 +4390,7 @@
 </file>
 
 <file path=word/header1.xml><?xml version="1.0" encoding="utf-8"?>
-<w:hdr xmlns:wpc="http://schemas.microsoft.com/office/word/2010/wordprocessingCanvas" xmlns:cx="http://schemas.microsoft.com/office/drawing/2014/chartex" xmlns:cx1="http://schemas.microsoft.com/office/drawing/2015/9/8/chartex" xmlns:cx2="http://schemas.microsoft.com/office/drawing/2015/10/21/chartex" xmlns:cx3="http://schemas.microsoft.com/office/drawing/2016/5/9/chartex" xmlns:cx4="http://schemas.microsoft.com/office/drawing/2016/5/10/chartex" xmlns:cx5="http://schemas.microsoft.com/office/drawing/2016/5/11/chartex" xmlns:cx6="http://schemas.microsoft.com/office/drawing/2016/5/12/chartex" xmlns:cx7="http://schemas.microsoft.com/office/drawing/2016/5/13/chartex" xmlns:cx8="http://schemas.microsoft.com/office/drawing/2016/5/14/chartex" xmlns:mc="http://schemas.openxmlformats.org/markup-compatibility/2006" xmlns:aink="http://schemas.microsoft.com/office/drawing/2016/ink" xmlns:am3d="http://schemas.microsoft.com/office/drawing/2017/model3d" xmlns:o="urn:schemas-microsoft-com:office:office" xmlns:oel="http://schemas.microsoft.com/office/2019/extlst" xmlns:r="http://schemas.openxmlformats.org/officeDocument/2006/relationships" xmlns:m="http://schemas.openxmlformats.org/officeDocument/2006/math" xmlns:v="urn:schemas-microsoft-com:vml" xmlns:wp14="http://schemas.microsoft.com/office/word/2010/wordprocessingDrawing" xmlns:wp="http://schemas.openxmlformats.org/drawingml/2006/wordprocessingDrawing" xmlns:w10="urn:schemas-microsoft-com:office:word" xmlns:w="http://schemas.openxmlformats.org/wordprocessingml/2006/main" xmlns:w14="http://schemas.microsoft.com/office/word/2010/wordml" xmlns:w15="http://schemas.microsoft.com/office/word/2012/wordml" xmlns:w16cex="http://schemas.microsoft.com/office/word/2018/wordml/cex" xmlns:w16cid="http://schemas.microsoft.com/office/word/2016/wordml/cid" xmlns:w16="http://schemas.microsoft.com/office/word/2018/wordml" xmlns:w16sdtdh="http://schemas.microsoft.com/office/word/2020/wordml/sdtdatahash" xmlns:w16se="http://schemas.microsoft.com/office/word/2015/wordml/symex" xmlns:wpg="http://schemas.microsoft.com/office/word/2010/wordprocessingGroup" xmlns:wpi="http://schemas.microsoft.com/office/word/2010/wordprocessingInk" xmlns:wne="http://schemas.microsoft.com/office/word/2006/wordml" xmlns:wps="http://schemas.microsoft.com/office/word/2010/wordprocessingShape" mc:Ignorable="w14 w15 w16se w16cid w16 w16cex w16sdtdh wp14">
+<w:hdr xmlns:wpc="http://schemas.microsoft.com/office/word/2010/wordprocessingCanvas" xmlns:cx="http://schemas.microsoft.com/office/drawing/2014/chartex" xmlns:cx1="http://schemas.microsoft.com/office/drawing/2015/9/8/chartex" xmlns:cx2="http://schemas.microsoft.com/office/drawing/2015/10/21/chartex" xmlns:cx3="http://schemas.microsoft.com/office/drawing/2016/5/9/chartex" xmlns:cx4="http://schemas.microsoft.com/office/drawing/2016/5/10/chartex" xmlns:cx5="http://schemas.microsoft.com/office/drawing/2016/5/11/chartex" xmlns:cx6="http://schemas.microsoft.com/office/drawing/2016/5/12/chartex" xmlns:cx7="http://schemas.microsoft.com/office/drawing/2016/5/13/chartex" xmlns:cx8="http://schemas.microsoft.com/office/drawing/2016/5/14/chartex" xmlns:mc="http://schemas.openxmlformats.org/markup-compatibility/2006" xmlns:aink="http://schemas.microsoft.com/office/drawing/2016/ink" xmlns:am3d="http://schemas.microsoft.com/office/drawing/2017/model3d" xmlns:o="urn:schemas-microsoft-com:office:office" xmlns:oel="http://schemas.microsoft.com/office/2019/extlst" xmlns:r="http://schemas.openxmlformats.org/officeDocument/2006/relationships" xmlns:m="http://schemas.openxmlformats.org/officeDocument/2006/math" xmlns:v="urn:schemas-microsoft-com:vml" xmlns:wp14="http://schemas.microsoft.com/office/word/2010/wordprocessingDrawing" xmlns:wp="http://schemas.openxmlformats.org/drawingml/2006/wordprocessingDrawing" xmlns:w10="urn:schemas-microsoft-com:office:word" xmlns:w="http://schemas.openxmlformats.org/wordprocessingml/2006/main" xmlns:w14="http://schemas.microsoft.com/office/word/2010/wordml" xmlns:w15="http://schemas.microsoft.com/office/word/2012/wordml" xmlns:w16cex="http://schemas.microsoft.com/office/word/2018/wordml/cex" xmlns:w16cid="http://schemas.microsoft.com/office/word/2016/wordml/cid" xmlns:w16="http://schemas.microsoft.com/office/word/2018/wordml" xmlns:w16du="http://schemas.microsoft.com/office/word/2023/wordml/word16du" xmlns:w16sdtdh="http://schemas.microsoft.com/office/word/2020/wordml/sdtdatahash" xmlns:w16sdtfl="http://schemas.microsoft.com/office/word/2024/wordml/sdtformatlock" xmlns:w16se="http://schemas.microsoft.com/office/word/2015/wordml/symex" xmlns:wpg="http://schemas.microsoft.com/office/word/2010/wordprocessingGroup" xmlns:wpi="http://schemas.microsoft.com/office/word/2010/wordprocessingInk" xmlns:wne="http://schemas.microsoft.com/office/word/2006/wordml" xmlns:wps="http://schemas.microsoft.com/office/word/2010/wordprocessingShape" mc:Ignorable="w14 w15 w16se w16cid w16 w16cex w16sdtdh w16sdtfl w16du wp14">
   <w:p>
     <w:pPr>
       <w:pStyle w:val="Header"/>
@@ -4396,7 +4407,7 @@
 </file>
 
 <file path=word/numbering.xml><?xml version="1.0" encoding="utf-8"?>
-<w:numbering xmlns:wpc="http://schemas.microsoft.com/office/word/2010/wordprocessingCanvas" xmlns:cx="http://schemas.microsoft.com/office/drawing/2014/chartex" xmlns:cx1="http://schemas.microsoft.com/office/drawing/2015/9/8/chartex" xmlns:cx2="http://schemas.microsoft.com/office/drawing/2015/10/21/chartex" xmlns:cx3="http://schemas.microsoft.com/office/drawing/2016/5/9/chartex" xmlns:cx4="http://schemas.microsoft.com/office/drawing/2016/5/10/chartex" xmlns:cx5="http://schemas.microsoft.com/office/drawing/2016/5/11/chartex" xmlns:cx6="http://schemas.microsoft.com/office/drawing/2016/5/12/chartex" xmlns:cx7="http://schemas.microsoft.com/office/drawing/2016/5/13/chartex" xmlns:cx8="http://schemas.microsoft.com/office/drawing/2016/5/14/chartex" xmlns:mc="http://schemas.openxmlformats.org/markup-compatibility/2006" xmlns:aink="http://schemas.microsoft.com/office/drawing/2016/ink" xmlns:am3d="http://schemas.microsoft.com/office/drawing/2017/model3d" xmlns:o="urn:schemas-microsoft-com:office:office" xmlns:oel="http://schemas.microsoft.com/office/2019/extlst" xmlns:r="http://schemas.openxmlformats.org/officeDocument/2006/relationships" xmlns:m="http://schemas.openxmlformats.org/officeDocument/2006/math" xmlns:v="urn:schemas-microsoft-com:vml" xmlns:wp14="http://schemas.microsoft.com/office/word/2010/wordprocessingDrawing" xmlns:wp="http://schemas.openxmlformats.org/drawingml/2006/wordprocessingDrawing" xmlns:w10="urn:schemas-microsoft-com:office:word" xmlns:w="http://schemas.openxmlformats.org/wordprocessingml/2006/main" xmlns:w14="http://schemas.microsoft.com/office/word/2010/wordml" xmlns:w15="http://schemas.microsoft.com/office/word/2012/wordml" xmlns:w16cex="http://schemas.microsoft.com/office/word/2018/wordml/cex" xmlns:w16cid="http://schemas.microsoft.com/office/word/2016/wordml/cid" xmlns:w16="http://schemas.microsoft.com/office/word/2018/wordml" xmlns:w16sdtdh="http://schemas.microsoft.com/office/word/2020/wordml/sdtdatahash" xmlns:w16se="http://schemas.microsoft.com/office/word/2015/wordml/symex" xmlns:wpg="http://schemas.microsoft.com/office/word/2010/wordprocessingGroup" xmlns:wpi="http://schemas.microsoft.com/office/word/2010/wordprocessingInk" xmlns:wne="http://schemas.microsoft.com/office/word/2006/wordml" xmlns:wps="http://schemas.microsoft.com/office/word/2010/wordprocessingShape" mc:Ignorable="w14 w15 w16se w16cid w16 w16cex w16sdtdh wp14">
+<w:numbering xmlns:wpc="http://schemas.microsoft.com/office/word/2010/wordprocessingCanvas" xmlns:cx="http://schemas.microsoft.com/office/drawing/2014/chartex" xmlns:cx1="http://schemas.microsoft.com/office/drawing/2015/9/8/chartex" xmlns:cx2="http://schemas.microsoft.com/office/drawing/2015/10/21/chartex" xmlns:cx3="http://schemas.microsoft.com/office/drawing/2016/5/9/chartex" xmlns:cx4="http://schemas.microsoft.com/office/drawing/2016/5/10/chartex" xmlns:cx5="http://schemas.microsoft.com/office/drawing/2016/5/11/chartex" xmlns:cx6="http://schemas.microsoft.com/office/drawing/2016/5/12/chartex" xmlns:cx7="http://schemas.microsoft.com/office/drawing/2016/5/13/chartex" xmlns:cx8="http://schemas.microsoft.com/office/drawing/2016/5/14/chartex" xmlns:mc="http://schemas.openxmlformats.org/markup-compatibility/2006" xmlns:aink="http://schemas.microsoft.com/office/drawing/2016/ink" xmlns:am3d="http://schemas.microsoft.com/office/drawing/2017/model3d" xmlns:o="urn:schemas-microsoft-com:office:office" xmlns:oel="http://schemas.microsoft.com/office/2019/extlst" xmlns:r="http://schemas.openxmlformats.org/officeDocument/2006/relationships" xmlns:m="http://schemas.openxmlformats.org/officeDocument/2006/math" xmlns:v="urn:schemas-microsoft-com:vml" xmlns:wp14="http://schemas.microsoft.com/office/word/2010/wordprocessingDrawing" xmlns:wp="http://schemas.openxmlformats.org/drawingml/2006/wordprocessingDrawing" xmlns:w10="urn:schemas-microsoft-com:office:word" xmlns:w="http://schemas.openxmlformats.org/wordprocessingml/2006/main" xmlns:w14="http://schemas.microsoft.com/office/word/2010/wordml" xmlns:w15="http://schemas.microsoft.com/office/word/2012/wordml" xmlns:w16cex="http://schemas.microsoft.com/office/word/2018/wordml/cex" xmlns:w16cid="http://schemas.microsoft.com/office/word/2016/wordml/cid" xmlns:w16="http://schemas.microsoft.com/office/word/2018/wordml" xmlns:w16du="http://schemas.microsoft.com/office/word/2023/wordml/word16du" xmlns:w16sdtdh="http://schemas.microsoft.com/office/word/2020/wordml/sdtdatahash" xmlns:w16sdtfl="http://schemas.microsoft.com/office/word/2024/wordml/sdtformatlock" xmlns:w16se="http://schemas.microsoft.com/office/word/2015/wordml/symex" xmlns:wpg="http://schemas.microsoft.com/office/word/2010/wordprocessingGroup" xmlns:wpi="http://schemas.microsoft.com/office/word/2010/wordprocessingInk" xmlns:wne="http://schemas.microsoft.com/office/word/2006/wordml" xmlns:wps="http://schemas.microsoft.com/office/word/2010/wordprocessingShape" mc:Ignorable="w14 w15 w16se w16cid w16 w16cex w16sdtdh w16sdtfl w16du wp14">
   <w:abstractNum w:abstractNumId="0" w15:restartNumberingAfterBreak="0">
     <w:nsid w:val="11C7393F"/>
     <w:multiLevelType w:val="hybridMultilevel"/>
@@ -5882,7 +5893,7 @@
 </file>
 
 <file path=word/styles.xml><?xml version="1.0" encoding="utf-8"?>
-<w:styles xmlns:mc="http://schemas.openxmlformats.org/markup-compatibility/2006" xmlns:r="http://schemas.openxmlformats.org/officeDocument/2006/relationships" xmlns:w="http://schemas.openxmlformats.org/wordprocessingml/2006/main" xmlns:w14="http://schemas.microsoft.com/office/word/2010/wordml" xmlns:w15="http://schemas.microsoft.com/office/word/2012/wordml" xmlns:w16cex="http://schemas.microsoft.com/office/word/2018/wordml/cex" xmlns:w16cid="http://schemas.microsoft.com/office/word/2016/wordml/cid" xmlns:w16="http://schemas.microsoft.com/office/word/2018/wordml" xmlns:w16sdtdh="http://schemas.microsoft.com/office/word/2020/wordml/sdtdatahash" xmlns:w16se="http://schemas.microsoft.com/office/word/2015/wordml/symex" mc:Ignorable="w14 w15 w16se w16cid w16 w16cex w16sdtdh">
+<w:styles xmlns:mc="http://schemas.openxmlformats.org/markup-compatibility/2006" xmlns:r="http://schemas.openxmlformats.org/officeDocument/2006/relationships" xmlns:w="http://schemas.openxmlformats.org/wordprocessingml/2006/main" xmlns:w14="http://schemas.microsoft.com/office/word/2010/wordml" xmlns:w15="http://schemas.microsoft.com/office/word/2012/wordml" xmlns:w16cex="http://schemas.microsoft.com/office/word/2018/wordml/cex" xmlns:w16cid="http://schemas.microsoft.com/office/word/2016/wordml/cid" xmlns:w16="http://schemas.microsoft.com/office/word/2018/wordml" xmlns:w16du="http://schemas.microsoft.com/office/word/2023/wordml/word16du" xmlns:w16sdtdh="http://schemas.microsoft.com/office/word/2020/wordml/sdtdatahash" xmlns:w16sdtfl="http://schemas.microsoft.com/office/word/2024/wordml/sdtformatlock" xmlns:w16se="http://schemas.microsoft.com/office/word/2015/wordml/symex" mc:Ignorable="w14 w15 w16se w16cid w16 w16cex w16sdtdh w16sdtfl w16du">
   <w:docDefaults>
     <w:rPrDefault>
       <w:rPr>

</xml_diff>